<commit_message>
xray test scropt sync
</commit_message>
<xml_diff>
--- a/docs/QA/ExampleLibrary.docx
+++ b/docs/QA/ExampleLibrary.docx
@@ -55,23 +55,13 @@
       </w:r>
       <w:proofErr w:type="spellEnd"/>
       <w:r>
-        <w:t xml:space="preserve"> and Azure AD with MFA and CAPTCHA. Instead of automating the entire login flow, I automated authentication by calling the login API directly to obtain a JWT token and </w:t>
-      </w:r>
-      <w:proofErr w:type="gramStart"/>
-      <w:r>
-        <w:t>cached</w:t>
-      </w:r>
-      <w:proofErr w:type="gramEnd"/>
-      <w:r>
-        <w:t xml:space="preserve"> authenticated sessions using </w:t>
+        <w:t xml:space="preserve"> and Azure AD with MFA and CAPTCHA. Instead of automating the entire login flow, I automated authentication by calling the login API directly to obtain a JWT token and cached authenticated sessions using </w:t>
       </w:r>
       <w:proofErr w:type="spellStart"/>
-      <w:proofErr w:type="gramStart"/>
       <w:r>
         <w:t>cy.session</w:t>
       </w:r>
       <w:proofErr w:type="spellEnd"/>
-      <w:proofErr w:type="gramEnd"/>
       <w:r>
         <w:t>(). A single manual smoke test remained to verify the complete production login flow, including MFA and CAPTCHA.</w:t>
       </w:r>
@@ -119,65 +109,145 @@
         <w:t xml:space="preserve">This example demonstrates troubleshooting. A login test occasionally failed in CI because it relied on a fixed </w:t>
       </w:r>
       <w:proofErr w:type="spellStart"/>
-      <w:proofErr w:type="gramStart"/>
       <w:r>
         <w:t>cy.wait</w:t>
       </w:r>
       <w:proofErr w:type="spellEnd"/>
-      <w:proofErr w:type="gramEnd"/>
       <w:r>
         <w:t xml:space="preserve">() delay after clicking the Sign In button. Rather than increasing the timeout or adding retries, I investigated the root cause and replaced the fixed wait with </w:t>
       </w:r>
       <w:proofErr w:type="spellStart"/>
-      <w:proofErr w:type="gramStart"/>
       <w:r>
         <w:t>cy.intercept</w:t>
       </w:r>
       <w:proofErr w:type="spellEnd"/>
-      <w:proofErr w:type="gramEnd"/>
       <w:r>
         <w:t xml:space="preserve">() and </w:t>
       </w:r>
       <w:proofErr w:type="spellStart"/>
-      <w:proofErr w:type="gramStart"/>
       <w:r>
         <w:t>cy.wait</w:t>
       </w:r>
       <w:proofErr w:type="spellEnd"/>
       <w:r>
-        <w:t>("@</w:t>
-      </w:r>
-      <w:proofErr w:type="gramEnd"/>
-      <w:r>
-        <w:t>login"), synchronizing the test with the actual network request. This made the test reliable while reducing execution time.</w:t>
-      </w:r>
-    </w:p>
+        <w:t>("@login"), synchronizing the test with the actual network request. This made the test reliable while reducing execution time.</w:t>
+      </w:r>
+    </w:p>
+    <w:p>
+      <w:r>
+        <w:rPr>
+          <w:b/>
+          <w:bCs/>
+        </w:rPr>
+        <w:t>Example 6 – Azure DevOps CI/CD Pipeline</w:t>
+      </w:r>
+    </w:p>
+    <w:p>
+      <w:r>
+        <w:t>This example demonstrates enterprise CI/CD and release automation. I designed and built an end-to-end CI/CD pipeline in Azure DevOps Server (on-premises) from the ground up, integrating automated builds, unit tests, UI and API automation, quality gates, deployment validation, and release workflows. The pipeline automatically executed regression tests, generated reports, and provided rapid feedback to the development team. Later, I applied the same CI/CD principles using GitHub Actions. Although the platforms were different, the core concepts remained the same: continuous integration, automated quality gates, fast feedback, and reliable software delivery.</w:t>
+      </w:r>
+    </w:p>
+    <w:p/>
     <w:p>
       <w:pPr>
         <w:rPr>
-          <w:lang w:val="fr-FR"/>
+          <w:b/>
+          <w:bCs/>
         </w:rPr>
       </w:pPr>
       <w:r>
         <w:rPr>
           <w:b/>
           <w:bCs/>
-          <w:lang w:val="fr-FR"/>
-        </w:rPr>
-        <w:t>Example 6 – Azure DevOps CI/CD Pipeline</w:t>
-      </w:r>
-    </w:p>
-    <w:p>
-      <w:r>
-        <w:t>This example demonstrates enterprise CI/CD and release automation. I designed and built an end-to-end CI/CD pipeline in Azure DevOps Server (</w:t>
-      </w:r>
-      <w:proofErr w:type="gramStart"/>
-      <w:r>
-        <w:t>on-premises</w:t>
-      </w:r>
-      <w:proofErr w:type="gramEnd"/>
-      <w:r>
-        <w:t>) from the ground up, integrating automated builds, unit tests, UI and API automation, quality gates, deployment validation, and release workflows. The pipeline automatically executed regression tests, generated reports, and provided rapid feedback to the development team. Later, I applied the same CI/CD principles using GitHub Actions. Although the platforms were different, the core concepts remained the same: continuous integration, automated quality gates, fast feedback, and reliable software delivery.</w:t>
+        </w:rPr>
+        <w:t xml:space="preserve">Example </w:t>
+      </w:r>
+      <w:r>
+        <w:rPr>
+          <w:b/>
+          <w:bCs/>
+        </w:rPr>
+        <w:t>7</w:t>
+      </w:r>
+      <w:r>
+        <w:rPr>
+          <w:b/>
+          <w:bCs/>
+        </w:rPr>
+        <w:t xml:space="preserve"> – Xray Test Synchronization</w:t>
+      </w:r>
+    </w:p>
+    <w:p>
+      <w:pPr>
+        <w:rPr>
+          <w:b/>
+          <w:bCs/>
+        </w:rPr>
+      </w:pPr>
+      <w:r>
+        <w:rPr>
+          <w:b/>
+          <w:bCs/>
+        </w:rPr>
+        <w:t>Example 6 – Automated Xray Test Synchronization</w:t>
+      </w:r>
+    </w:p>
+    <w:p>
+      <w:r>
+        <w:t>As the Cypress automation suite grew, creating Xray Test issues one by one and mapping each issue back to its corresponding Cypress test became time-consuming and difficult to maintain. Every new automated test required manual setup before results could be imported into Xray.</w:t>
+      </w:r>
+    </w:p>
+    <w:p>
+      <w:r>
+        <w:t>To streamline the process, I developed a PowerShell synchronization tool that scans the Cypress test suite, extracts all automated test cases, compares them with existing Xray Test issues, and automatically creates any missing Xray Tests through the Xray REST API. When new Cypress tests are added, I simply rerun the synchronization script before executing the regression suite, eliminating repetitive manual maintenance and keeping the automation repository synchronized with Xray.</w:t>
+      </w:r>
+    </w:p>
+    <w:p>
+      <w:r>
+        <w:t>As a future enhancement, I would schedule the synchronization script to run nightly. The job would automatically detect new, renamed, or deleted Cypress tests, create missing Xray Test issues, update existing mappings, and mark obsolete Xray Tests as inactive after validation. This would provide fully automated synchronization between the Cypress repository and Xray with minimal manual effort.</w:t>
+      </w:r>
+    </w:p>
+    <w:p>
+      <w:pPr>
+        <w:rPr>
+          <w:b/>
+          <w:bCs/>
+          <w:vanish/>
+        </w:rPr>
+      </w:pPr>
+      <w:r>
+        <w:rPr>
+          <w:b/>
+          <w:bCs/>
+          <w:vanish/>
+        </w:rPr>
+        <w:t>Top of Form</w:t>
+      </w:r>
+    </w:p>
+    <w:p>
+      <w:pPr>
+        <w:rPr>
+          <w:b/>
+          <w:bCs/>
+        </w:rPr>
+      </w:pPr>
+    </w:p>
+    <w:p>
+      <w:pPr>
+        <w:rPr>
+          <w:b/>
+          <w:bCs/>
+          <w:vanish/>
+        </w:rPr>
+      </w:pPr>
+      <w:r>
+        <w:rPr>
+          <w:b/>
+          <w:bCs/>
+          <w:vanish/>
+        </w:rPr>
+        <w:lastRenderedPageBreak/>
+        <w:t>Bottom of Form</w:t>
       </w:r>
     </w:p>
     <w:p/>

</xml_diff>